<commit_message>
intiele opzet pipeline en analyse volgens plan of attack, to be tested
</commit_message>
<xml_diff>
--- a/docs/meeting-notes/Huddle 27.docx
+++ b/docs/meeting-notes/Huddle 27.docx
@@ -9,19 +9,11 @@
           <w:lang w:val="nl-BE"/>
         </w:rPr>
       </w:pPr>
-      <w:proofErr w:type="spellStart"/>
-      <w:r>
-        <w:rPr>
-          <w:lang w:val="nl-BE"/>
-        </w:rPr>
-        <w:t>Huddle</w:t>
-      </w:r>
-      <w:proofErr w:type="spellEnd"/>
-      <w:r>
-        <w:rPr>
-          <w:lang w:val="nl-BE"/>
-        </w:rPr>
-        <w:t xml:space="preserve"> 27/03/2026</w:t>
+      <w:r>
+        <w:rPr>
+          <w:lang w:val="nl-BE"/>
+        </w:rPr>
+        <w:t>Huddle 27/03/2026</w:t>
       </w:r>
     </w:p>
     <w:p>
@@ -101,21 +93,7 @@
         <w:rPr>
           <w:lang w:val="nl-BE"/>
         </w:rPr>
-        <w:t xml:space="preserve">Gemiddelde waarden </w:t>
-      </w:r>
-      <w:proofErr w:type="spellStart"/>
-      <w:r>
-        <w:rPr>
-          <w:lang w:val="nl-BE"/>
-        </w:rPr>
-        <w:t>svmg</w:t>
-      </w:r>
-      <w:proofErr w:type="spellEnd"/>
-      <w:r>
-        <w:rPr>
-          <w:lang w:val="nl-BE"/>
-        </w:rPr>
-        <w:t xml:space="preserve"> – berekening ENMO?</w:t>
+        <w:t>Gemiddelde waarden svmg – berekening ENMO?</w:t>
       </w:r>
     </w:p>
     <w:p>
@@ -130,11 +108,9 @@
       <w:pPr>
         <w:pStyle w:val="NoSpacing"/>
       </w:pPr>
-      <w:proofErr w:type="spellStart"/>
       <w:r>
         <w:t>Autocallibratie</w:t>
       </w:r>
-      <w:proofErr w:type="spellEnd"/>
       <w:r>
         <w:t>? Config</w:t>
       </w:r>
@@ -203,54 +179,6 @@
           <w:lang w:val="nl-BE"/>
         </w:rPr>
       </w:pPr>
-      <w:r>
-        <w:rPr>
-          <w:lang w:val="nl-BE"/>
-        </w:rPr>
-        <w:t>Gemiddelde waarden</w:t>
-      </w:r>
-      <w:r>
-        <w:rPr>
-          <w:lang w:val="nl-BE"/>
-        </w:rPr>
-        <w:t xml:space="preserve"> </w:t>
-      </w:r>
-      <w:proofErr w:type="spellStart"/>
-      <w:r>
-        <w:rPr>
-          <w:lang w:val="nl-BE"/>
-        </w:rPr>
-        <w:t>SVM</w:t>
-      </w:r>
-      <w:r>
-        <w:rPr>
-          <w:lang w:val="nl-BE"/>
-        </w:rPr>
-        <w:t>g</w:t>
-      </w:r>
-      <w:proofErr w:type="spellEnd"/>
-      <w:r>
-        <w:rPr>
-          <w:lang w:val="nl-BE"/>
-        </w:rPr>
-        <w:t xml:space="preserve"> – berekening ENMO?</w:t>
-      </w:r>
-    </w:p>
-    <w:p>
-      <w:pPr>
-        <w:pStyle w:val="NoSpacing"/>
-        <w:rPr>
-          <w:lang w:val="nl-BE"/>
-        </w:rPr>
-      </w:pPr>
-    </w:p>
-    <w:p>
-      <w:pPr>
-        <w:pStyle w:val="NoSpacing"/>
-        <w:rPr>
-          <w:lang w:val="nl-BE"/>
-        </w:rPr>
-      </w:pPr>
     </w:p>
     <w:p>
       <w:pPr>
@@ -277,19 +205,11 @@
           <w:lang w:val="nl-BE"/>
         </w:rPr>
       </w:pPr>
-      <w:proofErr w:type="spellStart"/>
-      <w:r>
-        <w:rPr>
-          <w:lang w:val="nl-BE"/>
-        </w:rPr>
-        <w:t>Doorname</w:t>
-      </w:r>
-      <w:proofErr w:type="spellEnd"/>
-      <w:r>
-        <w:rPr>
-          <w:lang w:val="nl-BE"/>
-        </w:rPr>
-        <w:t xml:space="preserve"> van alle informatie tegen maandag/dinsdag</w:t>
+      <w:r>
+        <w:rPr>
+          <w:lang w:val="nl-BE"/>
+        </w:rPr>
+        <w:t>Doorname van alle informatie tegen maandag/dinsdag</w:t>
       </w:r>
     </w:p>
     <w:p>
@@ -345,14 +265,12 @@
           <w:lang w:val="nl-BE"/>
         </w:rPr>
       </w:pPr>
-      <w:proofErr w:type="spellStart"/>
       <w:r>
         <w:rPr>
           <w:lang w:val="nl-BE"/>
         </w:rPr>
         <w:t>Shiny</w:t>
       </w:r>
-      <w:proofErr w:type="spellEnd"/>
     </w:p>
     <w:p>
       <w:pPr>

</xml_diff>